<commit_message>
Add remaining pipeline screenshots and embed all 10 into final report
Captured MLflow run tracking, Docker build/run/smoke-test, Minikube
Kubernetes deployment (pods/svc/ingress/hpa + live /predict), and
Grafana/Prometheus monitoring under a generated load test. Inserted
all screenshots with captions into report/MLOps_Assignment1_Report.docx
and filled in the Deliverables and Links section. Model artifacts and
evaluation figures were regenerated by a fresh training run for the
MLflow screenshots (same pipeline, same results).

Co-Authored-By: Claude Sonnet 5 <noreply@anthropic.com>
</commit_message>
<xml_diff>
--- a/report/MLOps_Assignment1_Report.docx
+++ b/report/MLOps_Assignment1_Report.docx
@@ -73,7 +73,7 @@
           <w:sz w:val="24"/>
           <w:szCs w:val="24"/>
         </w:rPr>
-        <w:t xml:space="preserve">Student: [Your Name]</w:t>
+        <w:t>Student: Govind Patel</w:t>
       </w:r>
     </w:p>
     <w:p>
@@ -86,7 +86,7 @@
           <w:sz w:val="24"/>
           <w:szCs w:val="24"/>
         </w:rPr>
-        <w:t xml:space="preserve">BITS ID: [Your ID]</w:t>
+        <w:t>BITS ID: 2025AF05054</w:t>
       </w:r>
     </w:p>
     <w:p>
@@ -95,12 +95,7 @@
         <w:jc w:val="center"/>
       </w:pPr>
       <w:r>
-        <w:rPr>
-          <w:color w:val="1D4ED8"/>
-          <w:sz w:val="22"/>
-          <w:szCs w:val="22"/>
-        </w:rPr>
-        <w:t xml:space="preserve">Code repository: https://github.com/&lt;your-username&gt;/heart-risk-mlops</w:t>
+        <w:t>Code repository: https://github.com/2025af05054/heart-risk-mlops</w:t>
       </w:r>
     </w:p>
     <w:p>
@@ -326,13 +321,7 @@
         <w:ind w:left="140" w:right="140"/>
       </w:pPr>
       <w:r>
-        <w:rPr>
-          <w:rFonts w:ascii="Consolas" w:cs="Consolas" w:eastAsia="Consolas" w:hAnsi="Consolas"/>
-          <w:color w:val="1F2937"/>
-          <w:sz w:val="17"/>
-          <w:szCs w:val="17"/>
-        </w:rPr>
-        <w:t xml:space="preserve">git clone https://github.com/&lt;your-username&gt;/heart-risk-mlops &amp;&amp; cd heart-risk-mlops</w:t>
+        <w:t>git clone https://github.com/2025af05054/heart-risk-mlops &amp;&amp; cd heart-risk-mlops</w:t>
       </w:r>
     </w:p>
     <w:p>
@@ -4216,6 +4205,94 @@
       </w:tr>
     </w:tbl>
     <w:p>
+      <w:r>
+        <w:drawing>
+          <wp:inline xmlns:a="http://schemas.openxmlformats.org/drawingml/2006/main" xmlns:pic="http://schemas.openxmlformats.org/drawingml/2006/picture">
+            <wp:extent cx="5486400" cy="3104941"/>
+            <wp:docPr id="2" name="Picture 2"/>
+            <wp:cNvGraphicFramePr>
+              <a:graphicFrameLocks noChangeAspect="1"/>
+            </wp:cNvGraphicFramePr>
+            <a:graphic>
+              <a:graphicData uri="http://schemas.openxmlformats.org/drawingml/2006/picture">
+                <pic:pic>
+                  <pic:nvPicPr>
+                    <pic:cNvPr id="0" name="02_mlflow_run_detail.png"/>
+                    <pic:cNvPicPr/>
+                  </pic:nvPicPr>
+                  <pic:blipFill>
+                    <a:blip r:embed="rId18"/>
+                    <a:stretch>
+                      <a:fillRect/>
+                    </a:stretch>
+                  </pic:blipFill>
+                  <pic:spPr>
+                    <a:xfrm>
+                      <a:off x="0" y="0"/>
+                      <a:ext cx="5486400" cy="3104941"/>
+                    </a:xfrm>
+                    <a:prstGeom prst="rect"/>
+                  </pic:spPr>
+                </pic:pic>
+              </a:graphicData>
+            </a:graphic>
+          </wp:inline>
+        </w:drawing>
+      </w:r>
+    </w:p>
+    <w:p>
+      <w:r>
+        <w:rPr>
+          <w:i/>
+        </w:rPr>
+        <w:t>Figure 10. MLflow run detail for the champion (logistic_regression): CV/test metrics and child runs.</w:t>
+      </w:r>
+    </w:p>
+    <w:p>
+      <w:r>
+        <w:drawing>
+          <wp:inline xmlns:a="http://schemas.openxmlformats.org/drawingml/2006/main" xmlns:pic="http://schemas.openxmlformats.org/drawingml/2006/picture">
+            <wp:extent cx="5486400" cy="3104941"/>
+            <wp:docPr id="3" name="Picture 3"/>
+            <wp:cNvGraphicFramePr>
+              <a:graphicFrameLocks noChangeAspect="1"/>
+            </wp:cNvGraphicFramePr>
+            <a:graphic>
+              <a:graphicData uri="http://schemas.openxmlformats.org/drawingml/2006/picture">
+                <pic:pic>
+                  <pic:nvPicPr>
+                    <pic:cNvPr id="0" name="01_mlflow_runs.png"/>
+                    <pic:cNvPicPr/>
+                  </pic:nvPicPr>
+                  <pic:blipFill>
+                    <a:blip r:embed="rId19"/>
+                    <a:stretch>
+                      <a:fillRect/>
+                    </a:stretch>
+                  </pic:blipFill>
+                  <pic:spPr>
+                    <a:xfrm>
+                      <a:off x="0" y="0"/>
+                      <a:ext cx="5486400" cy="3104941"/>
+                    </a:xfrm>
+                    <a:prstGeom prst="rect"/>
+                  </pic:spPr>
+                </pic:pic>
+              </a:graphicData>
+            </a:graphic>
+          </wp:inline>
+        </w:drawing>
+      </w:r>
+    </w:p>
+    <w:p>
+      <w:r>
+        <w:rPr>
+          <w:i/>
+        </w:rPr>
+        <w:t>Figure 9. MLflow Training runs view: all 83 runs (5 parent + 77 nested candidates + 1 champion-selection run).</w:t>
+      </w:r>
+    </w:p>
+    <w:p>
       <w:pPr>
         <w:pStyle w:val="Heading1"/>
       </w:pPr>
@@ -5452,6 +5529,94 @@
       </w:tr>
     </w:tbl>
     <w:p>
+      <w:r>
+        <w:drawing>
+          <wp:inline xmlns:a="http://schemas.openxmlformats.org/drawingml/2006/main" xmlns:pic="http://schemas.openxmlformats.org/drawingml/2006/picture">
+            <wp:extent cx="5486400" cy="2895600"/>
+            <wp:docPr id="4" name="Picture 4"/>
+            <wp:cNvGraphicFramePr>
+              <a:graphicFrameLocks noChangeAspect="1"/>
+            </wp:cNvGraphicFramePr>
+            <a:graphic>
+              <a:graphicData uri="http://schemas.openxmlformats.org/drawingml/2006/picture">
+                <pic:pic>
+                  <pic:nvPicPr>
+                    <pic:cNvPr id="0" name="04_actions_artifacts.png"/>
+                    <pic:cNvPicPr/>
+                  </pic:nvPicPr>
+                  <pic:blipFill>
+                    <a:blip r:embed="rId20"/>
+                    <a:stretch>
+                      <a:fillRect/>
+                    </a:stretch>
+                  </pic:blipFill>
+                  <pic:spPr>
+                    <a:xfrm>
+                      <a:off x="0" y="0"/>
+                      <a:ext cx="5486400" cy="2895600"/>
+                    </a:xfrm>
+                    <a:prstGeom prst="rect"/>
+                  </pic:spPr>
+                </pic:pic>
+              </a:graphicData>
+            </a:graphic>
+          </wp:inline>
+        </w:drawing>
+      </w:r>
+    </w:p>
+    <w:p>
+      <w:r>
+        <w:rPr>
+          <w:i/>
+        </w:rPr>
+        <w:t>Figure 12. Workflow run artifacts (model-and-experiments, container-smoke-test, test-report).</w:t>
+      </w:r>
+    </w:p>
+    <w:p>
+      <w:r>
+        <w:drawing>
+          <wp:inline xmlns:a="http://schemas.openxmlformats.org/drawingml/2006/main" xmlns:pic="http://schemas.openxmlformats.org/drawingml/2006/picture">
+            <wp:extent cx="5486400" cy="3104941"/>
+            <wp:docPr id="5" name="Picture 5"/>
+            <wp:cNvGraphicFramePr>
+              <a:graphicFrameLocks noChangeAspect="1"/>
+            </wp:cNvGraphicFramePr>
+            <a:graphic>
+              <a:graphicData uri="http://schemas.openxmlformats.org/drawingml/2006/picture">
+                <pic:pic>
+                  <pic:nvPicPr>
+                    <pic:cNvPr id="0" name="03_actions_success.png"/>
+                    <pic:cNvPicPr/>
+                  </pic:nvPicPr>
+                  <pic:blipFill>
+                    <a:blip r:embed="rId21"/>
+                    <a:stretch>
+                      <a:fillRect/>
+                    </a:stretch>
+                  </pic:blipFill>
+                  <pic:spPr>
+                    <a:xfrm>
+                      <a:off x="0" y="0"/>
+                      <a:ext cx="5486400" cy="3104941"/>
+                    </a:xfrm>
+                    <a:prstGeom prst="rect"/>
+                  </pic:spPr>
+                </pic:pic>
+              </a:graphicData>
+            </a:graphic>
+          </wp:inline>
+        </w:drawing>
+      </w:r>
+    </w:p>
+    <w:p>
+      <w:r>
+        <w:rPr>
+          <w:i/>
+        </w:rPr>
+        <w:t>Figure 11. GitHub Actions run: lint -&gt; test -&gt; train -&gt; docker, all green.</w:t>
+      </w:r>
+    </w:p>
+    <w:p>
       <w:pPr>
         <w:pStyle w:val="Heading1"/>
       </w:pPr>
@@ -6220,6 +6385,94 @@
       </w:tr>
     </w:tbl>
     <w:p>
+      <w:r>
+        <w:drawing>
+          <wp:inline xmlns:a="http://schemas.openxmlformats.org/drawingml/2006/main" xmlns:pic="http://schemas.openxmlformats.org/drawingml/2006/picture">
+            <wp:extent cx="5486400" cy="3104245"/>
+            <wp:docPr id="6" name="Picture 6"/>
+            <wp:cNvGraphicFramePr>
+              <a:graphicFrameLocks noChangeAspect="1"/>
+            </wp:cNvGraphicFramePr>
+            <a:graphic>
+              <a:graphicData uri="http://schemas.openxmlformats.org/drawingml/2006/picture">
+                <pic:pic>
+                  <pic:nvPicPr>
+                    <pic:cNvPr id="0" name="06_docker_smoke.png"/>
+                    <pic:cNvPicPr/>
+                  </pic:nvPicPr>
+                  <pic:blipFill>
+                    <a:blip r:embed="rId22"/>
+                    <a:stretch>
+                      <a:fillRect/>
+                    </a:stretch>
+                  </pic:blipFill>
+                  <pic:spPr>
+                    <a:xfrm>
+                      <a:off x="0" y="0"/>
+                      <a:ext cx="5486400" cy="3104245"/>
+                    </a:xfrm>
+                    <a:prstGeom prst="rect"/>
+                  </pic:spPr>
+                </pic:pic>
+              </a:graphicData>
+            </a:graphic>
+          </wp:inline>
+        </w:drawing>
+      </w:r>
+    </w:p>
+    <w:p>
+      <w:r>
+        <w:rPr>
+          <w:i/>
+        </w:rPr>
+        <w:t>Figure 14. Smoke test against the running container: /health, /ready, /model-info, /predict, /metrics.</w:t>
+      </w:r>
+    </w:p>
+    <w:p>
+      <w:r>
+        <w:drawing>
+          <wp:inline xmlns:a="http://schemas.openxmlformats.org/drawingml/2006/main" xmlns:pic="http://schemas.openxmlformats.org/drawingml/2006/picture">
+            <wp:extent cx="5486400" cy="3104941"/>
+            <wp:docPr id="7" name="Picture 7"/>
+            <wp:cNvGraphicFramePr>
+              <a:graphicFrameLocks noChangeAspect="1"/>
+            </wp:cNvGraphicFramePr>
+            <a:graphic>
+              <a:graphicData uri="http://schemas.openxmlformats.org/drawingml/2006/picture">
+                <pic:pic>
+                  <pic:nvPicPr>
+                    <pic:cNvPr id="0" name="05_docker_build_ps.png"/>
+                    <pic:cNvPicPr/>
+                  </pic:nvPicPr>
+                  <pic:blipFill>
+                    <a:blip r:embed="rId23"/>
+                    <a:stretch>
+                      <a:fillRect/>
+                    </a:stretch>
+                  </pic:blipFill>
+                  <pic:spPr>
+                    <a:xfrm>
+                      <a:off x="0" y="0"/>
+                      <a:ext cx="5486400" cy="3104941"/>
+                    </a:xfrm>
+                    <a:prstGeom prst="rect"/>
+                  </pic:spPr>
+                </pic:pic>
+              </a:graphicData>
+            </a:graphic>
+          </wp:inline>
+        </w:drawing>
+      </w:r>
+    </w:p>
+    <w:p>
+      <w:r>
+        <w:rPr>
+          <w:i/>
+        </w:rPr>
+        <w:t>Figure 13. Docker image build and container running (healthy).</w:t>
+      </w:r>
+    </w:p>
+    <w:p>
       <w:pPr>
         <w:pStyle w:val="Heading1"/>
       </w:pPr>
@@ -7050,6 +7303,94 @@
         </w:tc>
       </w:tr>
     </w:tbl>
+    <w:p>
+      <w:r>
+        <w:drawing>
+          <wp:inline xmlns:a="http://schemas.openxmlformats.org/drawingml/2006/main" xmlns:pic="http://schemas.openxmlformats.org/drawingml/2006/picture">
+            <wp:extent cx="5486400" cy="3104245"/>
+            <wp:docPr id="8" name="Picture 8"/>
+            <wp:cNvGraphicFramePr>
+              <a:graphicFrameLocks noChangeAspect="1"/>
+            </wp:cNvGraphicFramePr>
+            <a:graphic>
+              <a:graphicData uri="http://schemas.openxmlformats.org/drawingml/2006/picture">
+                <pic:pic>
+                  <pic:nvPicPr>
+                    <pic:cNvPr id="0" name="08_k8s_predict.png"/>
+                    <pic:cNvPicPr/>
+                  </pic:nvPicPr>
+                  <pic:blipFill>
+                    <a:blip r:embed="rId24"/>
+                    <a:stretch>
+                      <a:fillRect/>
+                    </a:stretch>
+                  </pic:blipFill>
+                  <pic:spPr>
+                    <a:xfrm>
+                      <a:off x="0" y="0"/>
+                      <a:ext cx="5486400" cy="3104245"/>
+                    </a:xfrm>
+                    <a:prstGeom prst="rect"/>
+                  </pic:spPr>
+                </pic:pic>
+              </a:graphicData>
+            </a:graphic>
+          </wp:inline>
+        </w:drawing>
+      </w:r>
+    </w:p>
+    <w:p>
+      <w:r>
+        <w:rPr>
+          <w:i/>
+        </w:rPr>
+        <w:t>Figure 16. /predict served through the Kubernetes Service (LoadBalancer).</w:t>
+      </w:r>
+    </w:p>
+    <w:p>
+      <w:r>
+        <w:drawing>
+          <wp:inline xmlns:a="http://schemas.openxmlformats.org/drawingml/2006/main" xmlns:pic="http://schemas.openxmlformats.org/drawingml/2006/picture">
+            <wp:extent cx="5486400" cy="3104245"/>
+            <wp:docPr id="9" name="Picture 9"/>
+            <wp:cNvGraphicFramePr>
+              <a:graphicFrameLocks noChangeAspect="1"/>
+            </wp:cNvGraphicFramePr>
+            <a:graphic>
+              <a:graphicData uri="http://schemas.openxmlformats.org/drawingml/2006/picture">
+                <pic:pic>
+                  <pic:nvPicPr>
+                    <pic:cNvPr id="0" name="07_k8s_resources.png"/>
+                    <pic:cNvPicPr/>
+                  </pic:nvPicPr>
+                  <pic:blipFill>
+                    <a:blip r:embed="rId25"/>
+                    <a:stretch>
+                      <a:fillRect/>
+                    </a:stretch>
+                  </pic:blipFill>
+                  <pic:spPr>
+                    <a:xfrm>
+                      <a:off x="0" y="0"/>
+                      <a:ext cx="5486400" cy="3104245"/>
+                    </a:xfrm>
+                    <a:prstGeom prst="rect"/>
+                  </pic:spPr>
+                </pic:pic>
+              </a:graphicData>
+            </a:graphic>
+          </wp:inline>
+        </w:drawing>
+      </w:r>
+    </w:p>
+    <w:p>
+      <w:r>
+        <w:rPr>
+          <w:i/>
+        </w:rPr>
+        <w:t>Figure 15. kubectl -n heart-mlops get pods,svc,ingress,hpa — 2 API pods, Prometheus, Grafana, HPA, ingress all up.</w:t>
+      </w:r>
+    </w:p>
     <w:p>
       <w:pPr>
         <w:pStyle w:val="Heading1"/>
@@ -8010,6 +8351,94 @@
       </w:tr>
     </w:tbl>
     <w:p>
+      <w:r>
+        <w:drawing>
+          <wp:inline xmlns:a="http://schemas.openxmlformats.org/drawingml/2006/main" xmlns:pic="http://schemas.openxmlformats.org/drawingml/2006/picture">
+            <wp:extent cx="5486400" cy="3104245"/>
+            <wp:docPr id="10" name="Picture 10"/>
+            <wp:cNvGraphicFramePr>
+              <a:graphicFrameLocks noChangeAspect="1"/>
+            </wp:cNvGraphicFramePr>
+            <a:graphic>
+              <a:graphicData uri="http://schemas.openxmlformats.org/drawingml/2006/picture">
+                <pic:pic>
+                  <pic:nvPicPr>
+                    <pic:cNvPr id="0" name="10_prometheus_targets.png"/>
+                    <pic:cNvPicPr/>
+                  </pic:nvPicPr>
+                  <pic:blipFill>
+                    <a:blip r:embed="rId26"/>
+                    <a:stretch>
+                      <a:fillRect/>
+                    </a:stretch>
+                  </pic:blipFill>
+                  <pic:spPr>
+                    <a:xfrm>
+                      <a:off x="0" y="0"/>
+                      <a:ext cx="5486400" cy="3104245"/>
+                    </a:xfrm>
+                    <a:prstGeom prst="rect"/>
+                  </pic:spPr>
+                </pic:pic>
+              </a:graphicData>
+            </a:graphic>
+          </wp:inline>
+        </w:drawing>
+      </w:r>
+    </w:p>
+    <w:p>
+      <w:r>
+        <w:rPr>
+          <w:i/>
+        </w:rPr>
+        <w:t>Figure 18. Prometheus Status -&gt; Targets: both heart-api pods UP via pod discovery.</w:t>
+      </w:r>
+    </w:p>
+    <w:p>
+      <w:r>
+        <w:drawing>
+          <wp:inline xmlns:a="http://schemas.openxmlformats.org/drawingml/2006/main" xmlns:pic="http://schemas.openxmlformats.org/drawingml/2006/picture">
+            <wp:extent cx="5486400" cy="2897797"/>
+            <wp:docPr id="11" name="Picture 11"/>
+            <wp:cNvGraphicFramePr>
+              <a:graphicFrameLocks noChangeAspect="1"/>
+            </wp:cNvGraphicFramePr>
+            <a:graphic>
+              <a:graphicData uri="http://schemas.openxmlformats.org/drawingml/2006/picture">
+                <pic:pic>
+                  <pic:nvPicPr>
+                    <pic:cNvPr id="0" name="09_grafana.png"/>
+                    <pic:cNvPicPr/>
+                  </pic:nvPicPr>
+                  <pic:blipFill>
+                    <a:blip r:embed="rId27"/>
+                    <a:stretch>
+                      <a:fillRect/>
+                    </a:stretch>
+                  </pic:blipFill>
+                  <pic:spPr>
+                    <a:xfrm>
+                      <a:off x="0" y="0"/>
+                      <a:ext cx="5486400" cy="2897797"/>
+                    </a:xfrm>
+                    <a:prstGeom prst="rect"/>
+                  </pic:spPr>
+                </pic:pic>
+              </a:graphicData>
+            </a:graphic>
+          </wp:inline>
+        </w:drawing>
+      </w:r>
+    </w:p>
+    <w:p>
+      <w:r>
+        <w:rPr>
+          <w:i/>
+        </w:rPr>
+        <w:t>Figure 17. Grafana dashboard after scripts/load_test.py: predictions, request rate, p95 latency, error ratio.</w:t>
+      </w:r>
+    </w:p>
+    <w:p>
       <w:pPr>
         <w:pStyle w:val="Heading1"/>
       </w:pPr>
@@ -8075,6 +8504,31 @@
       </w:pPr>
       <w:r>
         <w:t xml:space="preserve">12. Deliverables and Links</w:t>
+      </w:r>
+    </w:p>
+    <w:p>
+      <w:r>
+        <w:t>Code repository: https://github.com/2025af05054/heart-risk-mlops (public).</w:t>
+      </w:r>
+    </w:p>
+    <w:p>
+      <w:r>
+        <w:t>Deployed API: no public cloud endpoint is used for this submission; the service is verified locally end-to-end via Docker (docker run -p 8000:8000 heart-risk-api:1.0.0) and via Kubernetes/Minikube (kubectl apply -k k8s/, then kubectl -n heart-mlops port-forward svc/heart-api 8080:80, or minikube tunnel for a routable LoadBalancer IP). See Section 2 for exact commands.</w:t>
+      </w:r>
+    </w:p>
+    <w:p>
+      <w:r>
+        <w:t>Pipeline video: see link on the title page.</w:t>
+      </w:r>
+    </w:p>
+    <w:p>
+      <w:r>
+        <w:t>Screenshots: screenshots/ in the repository and Figures 9-18 above cover MLflow tracking, the GitHub Actions run and its artifacts, the Docker build/run/smoke test, the Kubernetes resources and a live /predict call through the Service, and the Grafana/Prometheus monitoring stack under load.</w:t>
+      </w:r>
+    </w:p>
+    <w:p>
+      <w:r>
+        <w:t>Reproduce end-to-end: git clone the repository, then follow Section 2 (venv + make targets) for data/EDA/training, Section 8 for the Docker image, and Section 9 for the Minikube deployment.</w:t>
       </w:r>
     </w:p>
     <w:tbl>

</xml_diff>

<commit_message>
Drop video dependency from report, submission-ready
Replace the unfilled video-link placeholder with a note pointing to
the embedded pipeline screenshots (Figures 9-18) as the end-to-end
evidence instead.

Co-Authored-By: Claude Sonnet 5 <noreply@anthropic.com>
</commit_message>
<xml_diff>
--- a/report/MLOps_Assignment1_Report.docx
+++ b/report/MLOps_Assignment1_Report.docx
@@ -104,12 +104,7 @@
         <w:jc w:val="center"/>
       </w:pPr>
       <w:r>
-        <w:rPr>
-          <w:color w:val="1D4ED8"/>
-          <w:sz w:val="22"/>
-          <w:szCs w:val="22"/>
-        </w:rPr>
-        <w:t xml:space="preserve">Pipeline video: [link]</w:t>
+        <w:t>Pipeline video: not included in this submission; the GitHub Actions run (Figures 11-12), Docker and Kubernetes screenshots (Figures 13-16), and Grafana/Prometheus screenshots (Figures 17-18) document the pipeline end-to-end instead.</w:t>
       </w:r>
     </w:p>
     <w:p>
@@ -8518,7 +8513,7 @@
     </w:p>
     <w:p>
       <w:r>
-        <w:t>Pipeline video: see link on the title page.</w:t>
+        <w:t>Pipeline video: not recorded for this submission (see Figures 9-18 for end-to-end evidence: MLflow tracking, CI run, Docker, Kubernetes deployment, and monitoring).</w:t>
       </w:r>
     </w:p>
     <w:p>

</xml_diff>